<commit_message>
Finished Naive RAG| Finalized for code for presentation | created final ppt | updated monthly report docs
</commit_message>
<xml_diff>
--- a/Format for Title of dissertation or research project by ACR and SRC.docx
+++ b/Format for Title of dissertation or research project by ACR and SRC.docx
@@ -333,13 +333,7 @@
         <w:rPr>
           <w:sz w:val="20"/>
         </w:rPr>
-        <w:t>13454 (College roll no.), 23025570009 (University roll no.</w:t>
-      </w:r>
-      <w:r>
-        <w:rPr>
-          <w:sz w:val="20"/>
-        </w:rPr>
-        <w:t>)</w:t>
+        <w:t>13454 (College roll no.), 23025570009 (University roll no.)</w:t>
       </w:r>
     </w:p>
     <w:p>
@@ -481,7 +475,7 @@
           <w:sz w:val="20"/>
           <w:lang w:val="en-IN"/>
         </w:rPr>
-        <w:t>Hallucination Across</w:t>
+        <w:t>Hallucination Across various Retrieval Augmented Generation (RAG) Strategies</w:t>
       </w:r>
       <w:r>
         <w:rPr>
@@ -489,49 +483,7 @@
           <w:sz w:val="20"/>
           <w:lang w:val="en-IN"/>
         </w:rPr>
-        <w:t xml:space="preserve"> </w:t>
-      </w:r>
-      <w:r>
-        <w:rPr>
-          <w:spacing w:val="-4"/>
-          <w:sz w:val="20"/>
-          <w:lang w:val="en-IN"/>
-        </w:rPr>
-        <w:t xml:space="preserve">various </w:t>
-      </w:r>
-      <w:proofErr w:type="gramStart"/>
-      <w:r>
-        <w:rPr>
-          <w:spacing w:val="-4"/>
-          <w:sz w:val="20"/>
-          <w:lang w:val="en-IN"/>
-        </w:rPr>
-        <w:t xml:space="preserve">Retrieval </w:t>
-      </w:r>
-      <w:r>
-        <w:rPr>
-          <w:spacing w:val="-4"/>
-          <w:sz w:val="20"/>
-          <w:lang w:val="en-IN"/>
-        </w:rPr>
-        <w:t xml:space="preserve"> </w:t>
-      </w:r>
-      <w:r>
-        <w:rPr>
-          <w:spacing w:val="-4"/>
-          <w:sz w:val="20"/>
-          <w:lang w:val="en-IN"/>
-        </w:rPr>
-        <w:t>Augmented</w:t>
-      </w:r>
-      <w:proofErr w:type="gramEnd"/>
-      <w:r>
-        <w:rPr>
-          <w:spacing w:val="-4"/>
-          <w:sz w:val="20"/>
-          <w:lang w:val="en-IN"/>
-        </w:rPr>
-        <w:t xml:space="preserve"> Generation (RAG) Strategies</w:t>
+        <w:t>. A comparative study.</w:t>
       </w:r>
     </w:p>
     <w:p>
@@ -968,6 +920,33 @@
           <w:p>
             <w:pPr>
               <w:pStyle w:val="TableParagraph"/>
+              <w:jc w:val="center"/>
+              <w:rPr>
+                <w:sz w:val="18"/>
+                <w:lang w:val="en-IN"/>
+              </w:rPr>
+            </w:pPr>
+          </w:p>
+          <w:p>
+            <w:pPr>
+              <w:pStyle w:val="TableParagraph"/>
+              <w:jc w:val="center"/>
+              <w:rPr>
+                <w:sz w:val="18"/>
+                <w:lang w:val="en-IN"/>
+              </w:rPr>
+            </w:pPr>
+            <w:r>
+              <w:rPr>
+                <w:sz w:val="18"/>
+                <w:lang w:val="en-IN"/>
+              </w:rPr>
+              <w:t>Dr. Vidhi Khanduja</w:t>
+            </w:r>
+          </w:p>
+          <w:p>
+            <w:pPr>
+              <w:pStyle w:val="TableParagraph"/>
               <w:rPr>
                 <w:sz w:val="18"/>
               </w:rPr>
@@ -1061,10 +1040,17 @@
           <w:p>
             <w:pPr>
               <w:pStyle w:val="TableParagraph"/>
-              <w:rPr>
-                <w:sz w:val="18"/>
-              </w:rPr>
-            </w:pPr>
+              <w:jc w:val="center"/>
+              <w:rPr>
+                <w:sz w:val="18"/>
+              </w:rPr>
+            </w:pPr>
+            <w:r>
+              <w:rPr>
+                <w:sz w:val="18"/>
+              </w:rPr>
+              <w:t>Dr. Suyash Kumar</w:t>
+            </w:r>
           </w:p>
         </w:tc>
         <w:tc>
@@ -1182,6 +1168,24 @@
           <w:p>
             <w:pPr>
               <w:pStyle w:val="TableParagraph"/>
+              <w:jc w:val="center"/>
+              <w:rPr>
+                <w:sz w:val="18"/>
+                <w:lang w:val="en-IN"/>
+              </w:rPr>
+            </w:pPr>
+            <w:r>
+              <w:rPr>
+                <w:sz w:val="18"/>
+                <w:lang w:val="en-IN"/>
+              </w:rPr>
+              <w:t>Dr. Rangoli Bhatnagar</w:t>
+            </w:r>
+          </w:p>
+          <w:p>
+            <w:pPr>
+              <w:pStyle w:val="TableParagraph"/>
+              <w:jc w:val="center"/>
               <w:rPr>
                 <w:sz w:val="18"/>
               </w:rPr>
@@ -1482,10 +1486,18 @@
           <w:p>
             <w:pPr>
               <w:pStyle w:val="TableParagraph"/>
-              <w:rPr>
-                <w:sz w:val="18"/>
-              </w:rPr>
-            </w:pPr>
+              <w:jc w:val="center"/>
+              <w:rPr>
+                <w:sz w:val="18"/>
+              </w:rPr>
+            </w:pPr>
+            <w:r>
+              <w:rPr>
+                <w:sz w:val="18"/>
+                <w:lang w:val="en-IN"/>
+              </w:rPr>
+              <w:t>Dr. Vidhi Khanduja</w:t>
+            </w:r>
           </w:p>
         </w:tc>
         <w:tc>
@@ -1574,10 +1586,23 @@
           <w:p>
             <w:pPr>
               <w:pStyle w:val="TableParagraph"/>
-              <w:rPr>
-                <w:sz w:val="18"/>
-              </w:rPr>
-            </w:pPr>
+              <w:jc w:val="center"/>
+              <w:rPr>
+                <w:sz w:val="18"/>
+              </w:rPr>
+            </w:pPr>
+            <w:r>
+              <w:rPr>
+                <w:sz w:val="18"/>
+              </w:rPr>
+              <w:t xml:space="preserve">Dr. Harmeet </w:t>
+            </w:r>
+            <w:r>
+              <w:rPr>
+                <w:sz w:val="18"/>
+              </w:rPr>
+              <w:t>Kaur</w:t>
+            </w:r>
           </w:p>
         </w:tc>
         <w:tc>
@@ -1694,10 +1719,17 @@
           <w:p>
             <w:pPr>
               <w:pStyle w:val="TableParagraph"/>
-              <w:rPr>
-                <w:sz w:val="18"/>
-              </w:rPr>
-            </w:pPr>
+              <w:jc w:val="center"/>
+              <w:rPr>
+                <w:sz w:val="18"/>
+              </w:rPr>
+            </w:pPr>
+            <w:r>
+              <w:rPr>
+                <w:sz w:val="18"/>
+              </w:rPr>
+              <w:t>Dr. Suyash Kumar</w:t>
+            </w:r>
           </w:p>
         </w:tc>
         <w:tc>
@@ -1904,7 +1936,6 @@
       <w:lvlJc w:val="left"/>
       <w:pPr>
         <w:ind w:left="306" w:hanging="207"/>
-        <w:jc w:val="left"/>
       </w:pPr>
       <w:rPr>
         <w:rFonts w:ascii="Times New Roman" w:eastAsia="Times New Roman" w:hAnsi="Times New Roman" w:cs="Times New Roman" w:hint="default"/>
@@ -2516,6 +2547,29 @@
       <w:u w:val="single" w:color="000000"/>
     </w:rPr>
   </w:style>
+  <w:style w:type="character" w:styleId="Hyperlink">
+    <w:name w:val="Hyperlink"/>
+    <w:basedOn w:val="DefaultParagraphFont"/>
+    <w:uiPriority w:val="99"/>
+    <w:unhideWhenUsed/>
+    <w:rsid w:val="00AA3977"/>
+    <w:rPr>
+      <w:color w:val="0000FF" w:themeColor="hyperlink"/>
+      <w:u w:val="single"/>
+    </w:rPr>
+  </w:style>
+  <w:style w:type="character" w:styleId="UnresolvedMention">
+    <w:name w:val="Unresolved Mention"/>
+    <w:basedOn w:val="DefaultParagraphFont"/>
+    <w:uiPriority w:val="99"/>
+    <w:semiHidden/>
+    <w:unhideWhenUsed/>
+    <w:rsid w:val="00AA3977"/>
+    <w:rPr>
+      <w:color w:val="605E5C"/>
+      <w:shd w:val="clear" w:color="auto" w:fill="E1DFDD"/>
+    </w:rPr>
+  </w:style>
 </w:styles>
 </file>
 

</xml_diff>